<commit_message>
Opleiding en zakkaart: nagekeken tegen de bronnen, SEBIA 5 juist, soberder
SEBIA 5: de zeven dagen die de lesgever opgaf (bericht 6/10), aan te kruisen op de fiche, in plaats van 20-30 april. Zakkaart: Onlangs een voetwonde (2 weken tot 18 maanden), vak Vaak gemist weg want herhaling. Fiche zonder duurtijden, kortere teksten, getal en eenheid op een regel.

Co-Authored-By: Claude Opus 5.5 <noreply@anthropic.com>
</commit_message>
<xml_diff>
--- a/Educatie/Opleiding per centrum/PARADISE_opleiding_Aalst.docx
+++ b/Educatie/Opleiding per centrum/PARADISE_opleiding_Aalst.docx
@@ -38,7 +38,7 @@
           <w:color w:val="5A6A78"/>
           <w:sz w:val="17"/>
         </w:rPr>
-        <w:t>Uw opleiding, november 2026 tot november 2027  ·  stand op 7 oktober 2026  ·  voorstel, te bevestigen met de fiche op de volgende pagina</w:t>
+        <w:t>Stand op 7 oktober 2026  ·  voorstel, te bevestigen met de fiche op pagina 2</w:t>
       </w:r>
     </w:p>
     <w:tbl>
@@ -212,7 +212,7 @@
                 <w:color w:val="1B2630"/>
                 <w:sz w:val="17"/>
               </w:rPr>
-              <w:t>online, opgenomen · 1,5 u</w:t>
+              <w:t>online, opgenomen · 1,5 u</w:t>
             </w:r>
           </w:p>
         </w:tc>
@@ -298,7 +298,7 @@
                 <w:color w:val="1B2630"/>
                 <w:sz w:val="17"/>
               </w:rPr>
-              <w:t>online, opgenomen · 1,5 u</w:t>
+              <w:t>online, opgenomen · 1,5 u</w:t>
             </w:r>
           </w:p>
         </w:tc>
@@ -384,7 +384,7 @@
                 <w:color w:val="1B2630"/>
                 <w:sz w:val="17"/>
               </w:rPr>
-              <w:t>online, opgenomen · 1,5 u</w:t>
+              <w:t>online, opgenomen · 1,5 u</w:t>
             </w:r>
           </w:p>
         </w:tc>
@@ -470,7 +470,7 @@
                 <w:color w:val="1B2630"/>
                 <w:sz w:val="17"/>
               </w:rPr>
-              <w:t>in uw centrum · 2 u, eerst theorie, dan praktijk</w:t>
+              <w:t>in uw centrum · 2 u: theorie, dan praktijk</w:t>
             </w:r>
           </w:p>
         </w:tc>
@@ -491,7 +491,7 @@
                 <w:color w:val="1B2630"/>
                 <w:sz w:val="17"/>
               </w:rPr>
-              <w:t>podologen; artsen kunnen aansluiten bij de theorie</w:t>
+              <w:t>podologen; artsen kunnen bij de theorie</w:t>
             </w:r>
           </w:p>
         </w:tc>
@@ -535,7 +535,7 @@
                 <w:color w:val="1B2630"/>
                 <w:sz w:val="17"/>
               </w:rPr>
-              <w:t>Zelftest: de vragenlijsten eens zelf invullen</w:t>
+              <w:t>Zelftest vragenlijsten</w:t>
             </w:r>
           </w:p>
         </w:tc>
@@ -642,7 +642,7 @@
                 <w:color w:val="1B2630"/>
                 <w:sz w:val="17"/>
               </w:rPr>
-              <w:t>online, opgenomen · 2 u</w:t>
+              <w:t>online, opgenomen · 2 u</w:t>
             </w:r>
           </w:p>
         </w:tc>
@@ -728,7 +728,7 @@
                 <w:color w:val="1B2630"/>
                 <w:sz w:val="17"/>
               </w:rPr>
-              <w:t>groep Oost (Aalst, Leuven, Antwerpen, 2e podoloog Brugge), centraal, voorstel Leuven · 4 u</w:t>
+              <w:t>groep Oost, centraal (voorstel Leuven) · 4 u</w:t>
             </w:r>
           </w:p>
         </w:tc>
@@ -803,7 +803,7 @@
                 <w:color w:val="1B2630"/>
                 <w:sz w:val="17"/>
               </w:rPr>
-              <w:t>Droogloop: vier visites op een verzonnen deelnemer</w:t>
+              <w:t>Droogloop van de vier visites</w:t>
             </w:r>
           </w:p>
         </w:tc>
@@ -824,7 +824,7 @@
                 <w:color w:val="1B2630"/>
                 <w:sz w:val="17"/>
               </w:rPr>
-              <w:t>in uw centrum · 3,5 u plus 1 u debriefing</w:t>
+              <w:t>in uw centrum · 3,5 u + 1 u nabespreking</w:t>
             </w:r>
           </w:p>
         </w:tc>
@@ -899,7 +899,7 @@
                 <w:color w:val="1B2630"/>
                 <w:sz w:val="17"/>
               </w:rPr>
-              <w:t>SEBIA 3 en 4, voorstel</w:t>
+              <w:t>SEBIA 3 en 4 (voorstel)</w:t>
             </w:r>
           </w:p>
         </w:tc>
@@ -920,7 +920,7 @@
                 <w:color w:val="1B2630"/>
                 <w:sz w:val="17"/>
               </w:rPr>
-              <w:t>groep Oost, centraal · 4 u</w:t>
+              <w:t>groep Oost, centraal · 4 u</w:t>
             </w:r>
           </w:p>
         </w:tc>
@@ -964,7 +964,17 @@
                 <w:color w:val="00407A"/>
                 <w:sz w:val="17"/>
               </w:rPr>
-              <w:t>25 of 26 mrt, of 20–30 apr 2027</w:t>
+              <w:t>25 mrt tot 30 apr 2027</w:t>
+            </w:r>
+          </w:p>
+          <w:p>
+            <w:r>
+              <w:rPr>
+                <w:b w:val="0"/>
+                <w:color w:val="5A6A78"/>
+                <w:sz w:val="15"/>
+              </w:rPr>
+              <w:t>(u kiest de dag op de fiche)</w:t>
             </w:r>
           </w:p>
         </w:tc>
@@ -1006,7 +1016,7 @@
                 <w:color w:val="1B2630"/>
                 <w:sz w:val="17"/>
               </w:rPr>
-              <w:t>in uw centrum, met Fabienne Dobbels · 1,5 u</w:t>
+              <w:t>in uw centrum · 1,5 u per podoloog</w:t>
             </w:r>
           </w:p>
         </w:tc>
@@ -1092,7 +1102,7 @@
                 <w:color w:val="1B2630"/>
                 <w:sz w:val="17"/>
               </w:rPr>
-              <w:t>online · 1 u</w:t>
+              <w:t>online · 1 u</w:t>
             </w:r>
           </w:p>
         </w:tc>
@@ -1215,33 +1225,6 @@
     </w:p>
     <w:p>
       <w:pPr>
-        <w:tabs>
-          <w:tab w:pos="227" w:val="left"/>
-        </w:tabs>
-        <w:spacing w:before="0" w:after="40"/>
-        <w:ind w:left="227" w:hanging="227"/>
-      </w:pPr>
-      <w:r>
-        <w:rPr>
-          <w:b/>
-          <w:color w:val="00407A"/>
-          <w:sz w:val="18"/>
-        </w:rPr>
-        <w:t>·</w:t>
-        <w:tab/>
-        <w:t xml:space="preserve">Datum met optie B. </w:t>
-      </w:r>
-      <w:r>
-        <w:rPr>
-          <w:b w:val="0"/>
-          <w:color w:val="1B2630"/>
-          <w:sz w:val="18"/>
-        </w:rPr>
-        <w:t>U kiest op de fiche. De data van SEBIA 3 tot 6 zijn nog voorstellen; SEBIA geeft Fabienne Dobbels.</w:t>
-      </w:r>
-    </w:p>
-    <w:p>
-      <w:pPr>
         <w:spacing w:before="120" w:after="0"/>
       </w:pPr>
       <w:r>
@@ -1292,7 +1275,7 @@
           <w:color w:val="5A6A78"/>
           <w:sz w:val="17"/>
         </w:rPr>
-        <w:t>Graag ingevuld terug tegen vrijdag 16 oktober, aan janou.debuyser@kuleuven.be. Daarna ligt de kalender vast. De vakjes kunt u in Word aanklikken of op papier aankruisen.</w:t>
+        <w:t>Graag terug tegen vrijdag 16 oktober, aan janou.debuyser@kuleuven.be. De vakjes kunt u in Word aanklikken of op papier aankruisen.</w:t>
       </w:r>
     </w:p>
     <w:p>
@@ -1306,295 +1289,6 @@
           <w:sz w:val="22"/>
         </w:rPr>
         <w:t xml:space="preserve">1  </w:t>
-      </w:r>
-      <w:r>
-        <w:rPr>
-          <w:b/>
-          <w:color w:val="00407A"/>
-          <w:sz w:val="22"/>
-        </w:rPr>
-        <w:t>Kies optie A of B</w:t>
-      </w:r>
-    </w:p>
-    <w:tbl>
-      <w:tblPr>
-        <w:jc w:val="left"/>
-        <w:tblLook w:firstColumn="1" w:firstRow="1" w:lastColumn="0" w:lastRow="0" w:noHBand="0" w:noVBand="1" w:val="04A0"/>
-        <w:tblBorders>
-          <w:top w:val="single" w:sz="4" w:color="D8E2EA"/>
-          <w:left w:val="single" w:sz="4" w:color="D8E2EA"/>
-          <w:bottom w:val="single" w:sz="4" w:color="D8E2EA"/>
-          <w:right w:val="single" w:sz="4" w:color="D8E2EA"/>
-          <w:insideH w:val="single" w:sz="4" w:color="D8E2EA"/>
-          <w:insideV w:val="single" w:sz="4" w:color="D8E2EA"/>
-        </w:tblBorders>
-        <w:tblW w:w="9866" w:type="dxa"/>
-        <w:tblLayout w:type="fixed"/>
-      </w:tblPr>
-      <w:tblGrid>
-        <w:gridCol w:w="3402"/>
-        <w:gridCol w:w="1928"/>
-        <w:gridCol w:w="1928"/>
-        <w:gridCol w:w="2608"/>
-      </w:tblGrid>
-      <w:tr>
-        <w:tc>
-          <w:tcPr>
-            <w:tcW w:type="dxa" w:w="3402"/>
-            <w:shd w:val="clear" w:color="auto" w:fill="1D8DB0"/>
-            <w:tcMar>
-              <w:top w:w="40" w:type="dxa"/>
-              <w:bottom w:w="40" w:type="dxa"/>
-              <w:left w:w="80" w:type="dxa"/>
-              <w:right w:w="80" w:type="dxa"/>
-            </w:tcMar>
-          </w:tcPr>
-          <w:p>
-            <w:r>
-              <w:rPr>
-                <w:b/>
-                <w:color w:val="FFFFFF"/>
-                <w:sz w:val="15"/>
-              </w:rPr>
-              <w:t>Onderwerp</w:t>
-            </w:r>
-          </w:p>
-        </w:tc>
-        <w:tc>
-          <w:tcPr>
-            <w:tcW w:type="dxa" w:w="1928"/>
-            <w:shd w:val="clear" w:color="auto" w:fill="1D8DB0"/>
-            <w:tcMar>
-              <w:top w:w="40" w:type="dxa"/>
-              <w:bottom w:w="40" w:type="dxa"/>
-              <w:left w:w="80" w:type="dxa"/>
-              <w:right w:w="80" w:type="dxa"/>
-            </w:tcMar>
-          </w:tcPr>
-          <w:p>
-            <w:r>
-              <w:rPr>
-                <w:b/>
-                <w:color w:val="FFFFFF"/>
-                <w:sz w:val="15"/>
-              </w:rPr>
-              <w:t>Optie A</w:t>
-            </w:r>
-          </w:p>
-        </w:tc>
-        <w:tc>
-          <w:tcPr>
-            <w:tcW w:type="dxa" w:w="1928"/>
-            <w:shd w:val="clear" w:color="auto" w:fill="1D8DB0"/>
-            <w:tcMar>
-              <w:top w:w="40" w:type="dxa"/>
-              <w:bottom w:w="40" w:type="dxa"/>
-              <w:left w:w="80" w:type="dxa"/>
-              <w:right w:w="80" w:type="dxa"/>
-            </w:tcMar>
-          </w:tcPr>
-          <w:p>
-            <w:r>
-              <w:rPr>
-                <w:b/>
-                <w:color w:val="FFFFFF"/>
-                <w:sz w:val="15"/>
-              </w:rPr>
-              <w:t>Optie B</w:t>
-            </w:r>
-          </w:p>
-        </w:tc>
-        <w:tc>
-          <w:tcPr>
-            <w:tcW w:type="dxa" w:w="2608"/>
-            <w:shd w:val="clear" w:color="auto" w:fill="1D8DB0"/>
-            <w:tcMar>
-              <w:top w:w="40" w:type="dxa"/>
-              <w:bottom w:w="40" w:type="dxa"/>
-              <w:left w:w="80" w:type="dxa"/>
-              <w:right w:w="80" w:type="dxa"/>
-            </w:tcMar>
-          </w:tcPr>
-          <w:p>
-            <w:r>
-              <w:rPr>
-                <w:b/>
-                <w:color w:val="FFFFFF"/>
-                <w:sz w:val="15"/>
-              </w:rPr>
-              <w:t>Uw keuze</w:t>
-            </w:r>
-          </w:p>
-        </w:tc>
-      </w:tr>
-      <w:tr>
-        <w:tc>
-          <w:tcPr>
-            <w:tcW w:type="dxa" w:w="3402"/>
-            <w:tcMar>
-              <w:top w:w="40" w:type="dxa"/>
-              <w:bottom w:w="40" w:type="dxa"/>
-              <w:left w:w="80" w:type="dxa"/>
-              <w:right w:w="80" w:type="dxa"/>
-            </w:tcMar>
-          </w:tcPr>
-          <w:p>
-            <w:r>
-              <w:rPr>
-                <w:b w:val="0"/>
-                <w:color w:val="1B2630"/>
-                <w:sz w:val="17"/>
-              </w:rPr>
-              <w:t>SEBIA 5, 1,5 u per podoloog, in uw centrum, met Fabienne Dobbels</w:t>
-            </w:r>
-          </w:p>
-        </w:tc>
-        <w:tc>
-          <w:tcPr>
-            <w:tcW w:type="dxa" w:w="1928"/>
-            <w:tcMar>
-              <w:top w:w="40" w:type="dxa"/>
-              <w:bottom w:w="40" w:type="dxa"/>
-              <w:left w:w="80" w:type="dxa"/>
-              <w:right w:w="80" w:type="dxa"/>
-            </w:tcMar>
-          </w:tcPr>
-          <w:p>
-            <w:r>
-              <w:rPr>
-                <w:b w:val="0"/>
-                <w:color w:val="1B2630"/>
-                <w:sz w:val="17"/>
-              </w:rPr>
-              <w:t>25 of 26 maart, vóór de paasvakantie</w:t>
-            </w:r>
-          </w:p>
-        </w:tc>
-        <w:tc>
-          <w:tcPr>
-            <w:tcW w:type="dxa" w:w="1928"/>
-            <w:tcMar>
-              <w:top w:w="40" w:type="dxa"/>
-              <w:bottom w:w="40" w:type="dxa"/>
-              <w:left w:w="80" w:type="dxa"/>
-              <w:right w:w="80" w:type="dxa"/>
-            </w:tcMar>
-          </w:tcPr>
-          <w:p>
-            <w:r>
-              <w:rPr>
-                <w:b w:val="0"/>
-                <w:color w:val="1B2630"/>
-                <w:sz w:val="17"/>
-              </w:rPr>
-              <w:t>tussen 20 en 30 april, na de paasvakantie</w:t>
-            </w:r>
-          </w:p>
-        </w:tc>
-        <w:tc>
-          <w:tcPr>
-            <w:tcW w:type="dxa" w:w="2608"/>
-            <w:tcMar>
-              <w:top w:w="40" w:type="dxa"/>
-              <w:bottom w:w="40" w:type="dxa"/>
-              <w:left w:w="80" w:type="dxa"/>
-              <w:right w:w="80" w:type="dxa"/>
-            </w:tcMar>
-          </w:tcPr>
-          <w:p>
-            <w:sdt>
-              <w:sdtPr>
-                <w14:checkbox>
-                  <w14:checked w14:val="0"/>
-                  <w14:checkedState w14:val="2612" w14:font="MS Gothic"/>
-                  <w14:uncheckedState w14:val="2610" w14:font="MS Gothic"/>
-                </w14:checkbox>
-              </w:sdtPr>
-              <w:sdtContent>
-                <w:r>
-                  <w:rPr>
-                    <w:rFonts w:ascii="MS Gothic" w:eastAsia="MS Gothic" w:hAnsi="MS Gothic"/>
-                    <w:sz w:val="20"/>
-                  </w:rPr>
-                  <w:t>☐</w:t>
-                </w:r>
-              </w:sdtContent>
-            </w:sdt>
-            <w:r>
-              <w:rPr>
-                <w:b w:val="0"/>
-                <w:color w:val="1B2630"/>
-                <w:sz w:val="17"/>
-              </w:rPr>
-              <w:t xml:space="preserve"> A   </w:t>
-            </w:r>
-            <w:sdt>
-              <w:sdtPr>
-                <w14:checkbox>
-                  <w14:checked w14:val="0"/>
-                  <w14:checkedState w14:val="2612" w14:font="MS Gothic"/>
-                  <w14:uncheckedState w14:val="2610" w14:font="MS Gothic"/>
-                </w14:checkbox>
-              </w:sdtPr>
-              <w:sdtContent>
-                <w:r>
-                  <w:rPr>
-                    <w:rFonts w:ascii="MS Gothic" w:eastAsia="MS Gothic" w:hAnsi="MS Gothic"/>
-                    <w:sz w:val="20"/>
-                  </w:rPr>
-                  <w:t>☐</w:t>
-                </w:r>
-              </w:sdtContent>
-            </w:sdt>
-            <w:r>
-              <w:rPr>
-                <w:b w:val="0"/>
-                <w:color w:val="1B2630"/>
-                <w:sz w:val="17"/>
-              </w:rPr>
-              <w:t xml:space="preserve"> B   </w:t>
-            </w:r>
-            <w:sdt>
-              <w:sdtPr>
-                <w14:checkbox>
-                  <w14:checked w14:val="0"/>
-                  <w14:checkedState w14:val="2612" w14:font="MS Gothic"/>
-                  <w14:uncheckedState w14:val="2610" w14:font="MS Gothic"/>
-                </w14:checkbox>
-              </w:sdtPr>
-              <w:sdtContent>
-                <w:r>
-                  <w:rPr>
-                    <w:rFonts w:ascii="MS Gothic" w:eastAsia="MS Gothic" w:hAnsi="MS Gothic"/>
-                    <w:sz w:val="20"/>
-                  </w:rPr>
-                  <w:t>☐</w:t>
-                </w:r>
-              </w:sdtContent>
-            </w:sdt>
-            <w:r>
-              <w:rPr>
-                <w:b w:val="0"/>
-                <w:color w:val="1B2630"/>
-                <w:sz w:val="17"/>
-              </w:rPr>
-              <w:t xml:space="preserve"> geen van beide   </w:t>
-            </w:r>
-          </w:p>
-        </w:tc>
-      </w:tr>
-    </w:tbl>
-    <w:p>
-      <w:pPr>
-        <w:spacing w:before="200" w:after="80"/>
-      </w:pPr>
-      <w:r>
-        <w:rPr>
-          <w:b/>
-          <w:color w:val="FF7A00"/>
-          <w:sz w:val="22"/>
-        </w:rPr>
-        <w:t xml:space="preserve">2  </w:t>
       </w:r>
       <w:r>
         <w:rPr>
@@ -1621,14 +1315,14 @@
         <w:tblLayout w:type="fixed"/>
       </w:tblPr>
       <w:tblGrid>
-        <w:gridCol w:w="4876"/>
-        <w:gridCol w:w="2608"/>
-        <w:gridCol w:w="2381"/>
+        <w:gridCol w:w="4309"/>
+        <w:gridCol w:w="3289"/>
+        <w:gridCol w:w="2268"/>
       </w:tblGrid>
       <w:tr>
         <w:tc>
           <w:tcPr>
-            <w:tcW w:type="dxa" w:w="4876"/>
+            <w:tcW w:type="dxa" w:w="4309"/>
             <w:shd w:val="clear" w:color="auto" w:fill="1D8DB0"/>
             <w:tcMar>
               <w:top w:w="40" w:type="dxa"/>
@@ -1650,7 +1344,7 @@
         </w:tc>
         <w:tc>
           <w:tcPr>
-            <w:tcW w:type="dxa" w:w="2608"/>
+            <w:tcW w:type="dxa" w:w="3288"/>
             <w:shd w:val="clear" w:color="auto" w:fill="1D8DB0"/>
             <w:tcMar>
               <w:top w:w="40" w:type="dxa"/>
@@ -1672,7 +1366,7 @@
         </w:tc>
         <w:tc>
           <w:tcPr>
-            <w:tcW w:type="dxa" w:w="2381"/>
+            <w:tcW w:type="dxa" w:w="2268"/>
             <w:shd w:val="clear" w:color="auto" w:fill="1D8DB0"/>
             <w:tcMar>
               <w:top w:w="40" w:type="dxa"/>
@@ -1696,7 +1390,7 @@
       <w:tr>
         <w:tc>
           <w:tcPr>
-            <w:tcW w:type="dxa" w:w="4876"/>
+            <w:tcW w:type="dxa" w:w="4309"/>
             <w:tcMar>
               <w:top w:w="40" w:type="dxa"/>
               <w:bottom w:w="40" w:type="dxa"/>
@@ -1711,13 +1405,13 @@
                 <w:color w:val="1B2630"/>
                 <w:sz w:val="17"/>
               </w:rPr>
-              <w:t>Technologie, 2 u, in uw centrum</w:t>
+              <w:t>Technologie</w:t>
             </w:r>
           </w:p>
         </w:tc>
         <w:tc>
           <w:tcPr>
-            <w:tcW w:type="dxa" w:w="2608"/>
+            <w:tcW w:type="dxa" w:w="3288"/>
             <w:tcMar>
               <w:top w:w="40" w:type="dxa"/>
               <w:bottom w:w="40" w:type="dxa"/>
@@ -1738,7 +1432,7 @@
         </w:tc>
         <w:tc>
           <w:tcPr>
-            <w:tcW w:type="dxa" w:w="2381"/>
+            <w:tcW w:type="dxa" w:w="2268"/>
             <w:tcMar>
               <w:top w:w="40" w:type="dxa"/>
               <w:bottom w:w="40" w:type="dxa"/>
@@ -1805,7 +1499,7 @@
       <w:tr>
         <w:tc>
           <w:tcPr>
-            <w:tcW w:type="dxa" w:w="4876"/>
+            <w:tcW w:type="dxa" w:w="4309"/>
             <w:tcMar>
               <w:top w:w="40" w:type="dxa"/>
               <w:bottom w:w="40" w:type="dxa"/>
@@ -1820,13 +1514,13 @@
                 <w:color w:val="1B2630"/>
                 <w:sz w:val="17"/>
               </w:rPr>
-              <w:t>SEBIA 1 en 2, 4 u, groep Oost, centraal (voorstel Leuven), na de datacollectie online</w:t>
+              <w:t>SEBIA 1 en 2, groep Oost</w:t>
             </w:r>
           </w:p>
         </w:tc>
         <w:tc>
           <w:tcPr>
-            <w:tcW w:type="dxa" w:w="2608"/>
+            <w:tcW w:type="dxa" w:w="3288"/>
             <w:tcMar>
               <w:top w:w="40" w:type="dxa"/>
               <w:bottom w:w="40" w:type="dxa"/>
@@ -1847,7 +1541,7 @@
         </w:tc>
         <w:tc>
           <w:tcPr>
-            <w:tcW w:type="dxa" w:w="2381"/>
+            <w:tcW w:type="dxa" w:w="2268"/>
             <w:tcMar>
               <w:top w:w="40" w:type="dxa"/>
               <w:bottom w:w="40" w:type="dxa"/>
@@ -1914,7 +1608,7 @@
       <w:tr>
         <w:tc>
           <w:tcPr>
-            <w:tcW w:type="dxa" w:w="4876"/>
+            <w:tcW w:type="dxa" w:w="4309"/>
             <w:tcMar>
               <w:top w:w="40" w:type="dxa"/>
               <w:bottom w:w="40" w:type="dxa"/>
@@ -1929,13 +1623,13 @@
                 <w:color w:val="1B2630"/>
                 <w:sz w:val="17"/>
               </w:rPr>
-              <w:t>Droogloop en debriefing, 4,5 u, in uw centrum</w:t>
+              <w:t>Droogloop</w:t>
             </w:r>
           </w:p>
         </w:tc>
         <w:tc>
           <w:tcPr>
-            <w:tcW w:type="dxa" w:w="2608"/>
+            <w:tcW w:type="dxa" w:w="3288"/>
             <w:tcMar>
               <w:top w:w="40" w:type="dxa"/>
               <w:bottom w:w="40" w:type="dxa"/>
@@ -1956,7 +1650,7 @@
         </w:tc>
         <w:tc>
           <w:tcPr>
-            <w:tcW w:type="dxa" w:w="2381"/>
+            <w:tcW w:type="dxa" w:w="2268"/>
             <w:tcMar>
               <w:top w:w="40" w:type="dxa"/>
               <w:bottom w:w="40" w:type="dxa"/>
@@ -2023,7 +1717,7 @@
       <w:tr>
         <w:tc>
           <w:tcPr>
-            <w:tcW w:type="dxa" w:w="4876"/>
+            <w:tcW w:type="dxa" w:w="4309"/>
             <w:tcMar>
               <w:top w:w="40" w:type="dxa"/>
               <w:bottom w:w="40" w:type="dxa"/>
@@ -2038,13 +1732,13 @@
                 <w:color w:val="1B2630"/>
                 <w:sz w:val="17"/>
               </w:rPr>
-              <w:t>Inhaalslot droogloop</w:t>
+              <w:t>Inhaal droogloop</w:t>
             </w:r>
           </w:p>
         </w:tc>
         <w:tc>
           <w:tcPr>
-            <w:tcW w:type="dxa" w:w="2608"/>
+            <w:tcW w:type="dxa" w:w="3288"/>
             <w:tcMar>
               <w:top w:w="40" w:type="dxa"/>
               <w:bottom w:w="40" w:type="dxa"/>
@@ -2065,7 +1759,7 @@
         </w:tc>
         <w:tc>
           <w:tcPr>
-            <w:tcW w:type="dxa" w:w="2381"/>
+            <w:tcW w:type="dxa" w:w="2268"/>
             <w:tcMar>
               <w:top w:w="40" w:type="dxa"/>
               <w:bottom w:w="40" w:type="dxa"/>
@@ -2132,7 +1826,7 @@
       <w:tr>
         <w:tc>
           <w:tcPr>
-            <w:tcW w:type="dxa" w:w="4876"/>
+            <w:tcW w:type="dxa" w:w="4309"/>
             <w:tcMar>
               <w:top w:w="40" w:type="dxa"/>
               <w:bottom w:w="40" w:type="dxa"/>
@@ -2147,13 +1841,13 @@
                 <w:color w:val="1B2630"/>
                 <w:sz w:val="17"/>
               </w:rPr>
-              <w:t>SEBIA 3 en 4, 4 u, groep Oost; inhaal ma 8 mrt</w:t>
+              <w:t>SEBIA 3 en 4, groep Oost</w:t>
             </w:r>
           </w:p>
         </w:tc>
         <w:tc>
           <w:tcPr>
-            <w:tcW w:type="dxa" w:w="2608"/>
+            <w:tcW w:type="dxa" w:w="3288"/>
             <w:tcMar>
               <w:top w:w="40" w:type="dxa"/>
               <w:bottom w:w="40" w:type="dxa"/>
@@ -2174,7 +1868,7 @@
         </w:tc>
         <w:tc>
           <w:tcPr>
-            <w:tcW w:type="dxa" w:w="2381"/>
+            <w:tcW w:type="dxa" w:w="2268"/>
             <w:tcMar>
               <w:top w:w="40" w:type="dxa"/>
               <w:bottom w:w="40" w:type="dxa"/>
@@ -2249,6 +1943,248 @@
           <w:color w:val="FF7A00"/>
           <w:sz w:val="22"/>
         </w:rPr>
+        <w:t xml:space="preserve">2  </w:t>
+      </w:r>
+      <w:r>
+        <w:rPr>
+          <w:b/>
+          <w:color w:val="00407A"/>
+          <w:sz w:val="22"/>
+        </w:rPr>
+        <w:t>SEBIA 5: welke dagen passen?</w:t>
+      </w:r>
+    </w:p>
+    <w:p>
+      <w:pPr>
+        <w:spacing w:before="0" w:after="60"/>
+      </w:pPr>
+      <w:r>
+        <w:rPr>
+          <w:b w:val="0"/>
+          <w:color w:val="5A6A78"/>
+          <w:sz w:val="17"/>
+        </w:rPr>
+        <w:t>1,5 u per podoloog, in uw centrum. Dit zijn de dagen die de lesgever, Fabienne Dobbels, opgaf; kruis alles aan wat past.</w:t>
+      </w:r>
+    </w:p>
+    <w:p>
+      <w:pPr>
+        <w:spacing w:before="0" w:after="40"/>
+      </w:pPr>
+      <w:r>
+        <w:rPr>
+          <w:b/>
+          <w:color w:val="00407A"/>
+          <w:sz w:val="18"/>
+        </w:rPr>
+        <w:t xml:space="preserve">Vóór de paasvakantie:   </w:t>
+      </w:r>
+      <w:sdt>
+        <w:sdtPr>
+          <w14:checkbox>
+            <w14:checked w14:val="0"/>
+            <w14:checkedState w14:val="2612" w14:font="MS Gothic"/>
+            <w14:uncheckedState w14:val="2610" w14:font="MS Gothic"/>
+          </w14:checkbox>
+        </w:sdtPr>
+        <w:sdtContent>
+          <w:r>
+            <w:rPr>
+              <w:rFonts w:ascii="MS Gothic" w:eastAsia="MS Gothic" w:hAnsi="MS Gothic"/>
+              <w:sz w:val="20"/>
+            </w:rPr>
+            <w:t>☐</w:t>
+          </w:r>
+        </w:sdtContent>
+      </w:sdt>
+      <w:r>
+        <w:rPr>
+          <w:b w:val="0"/>
+          <w:color w:val="1B2630"/>
+          <w:sz w:val="17"/>
+        </w:rPr>
+        <w:t xml:space="preserve"> do 25 mrt, late namiddag   </w:t>
+      </w:r>
+      <w:sdt>
+        <w:sdtPr>
+          <w14:checkbox>
+            <w14:checked w14:val="0"/>
+            <w14:checkedState w14:val="2612" w14:font="MS Gothic"/>
+            <w14:uncheckedState w14:val="2610" w14:font="MS Gothic"/>
+          </w14:checkbox>
+        </w:sdtPr>
+        <w:sdtContent>
+          <w:r>
+            <w:rPr>
+              <w:rFonts w:ascii="MS Gothic" w:eastAsia="MS Gothic" w:hAnsi="MS Gothic"/>
+              <w:sz w:val="20"/>
+            </w:rPr>
+            <w:t>☐</w:t>
+          </w:r>
+        </w:sdtContent>
+      </w:sdt>
+      <w:r>
+        <w:rPr>
+          <w:b w:val="0"/>
+          <w:color w:val="1B2630"/>
+          <w:sz w:val="17"/>
+        </w:rPr>
+        <w:t xml:space="preserve"> vr 26 mrt   </w:t>
+      </w:r>
+    </w:p>
+    <w:p>
+      <w:pPr>
+        <w:spacing w:before="0" w:after="40"/>
+      </w:pPr>
+      <w:r>
+        <w:rPr>
+          <w:b/>
+          <w:color w:val="00407A"/>
+          <w:sz w:val="18"/>
+        </w:rPr>
+        <w:t xml:space="preserve">Na de paasvakantie:   </w:t>
+      </w:r>
+      <w:sdt>
+        <w:sdtPr>
+          <w14:checkbox>
+            <w14:checked w14:val="0"/>
+            <w14:checkedState w14:val="2612" w14:font="MS Gothic"/>
+            <w14:uncheckedState w14:val="2610" w14:font="MS Gothic"/>
+          </w14:checkbox>
+        </w:sdtPr>
+        <w:sdtContent>
+          <w:r>
+            <w:rPr>
+              <w:rFonts w:ascii="MS Gothic" w:eastAsia="MS Gothic" w:hAnsi="MS Gothic"/>
+              <w:sz w:val="20"/>
+            </w:rPr>
+            <w:t>☐</w:t>
+          </w:r>
+        </w:sdtContent>
+      </w:sdt>
+      <w:r>
+        <w:rPr>
+          <w:b w:val="0"/>
+          <w:color w:val="1B2630"/>
+          <w:sz w:val="17"/>
+        </w:rPr>
+        <w:t xml:space="preserve"> di 20 apr   </w:t>
+      </w:r>
+      <w:sdt>
+        <w:sdtPr>
+          <w14:checkbox>
+            <w14:checked w14:val="0"/>
+            <w14:checkedState w14:val="2612" w14:font="MS Gothic"/>
+            <w14:uncheckedState w14:val="2610" w14:font="MS Gothic"/>
+          </w14:checkbox>
+        </w:sdtPr>
+        <w:sdtContent>
+          <w:r>
+            <w:rPr>
+              <w:rFonts w:ascii="MS Gothic" w:eastAsia="MS Gothic" w:hAnsi="MS Gothic"/>
+              <w:sz w:val="20"/>
+            </w:rPr>
+            <w:t>☐</w:t>
+          </w:r>
+        </w:sdtContent>
+      </w:sdt>
+      <w:r>
+        <w:rPr>
+          <w:b w:val="0"/>
+          <w:color w:val="1B2630"/>
+          <w:sz w:val="17"/>
+        </w:rPr>
+        <w:t xml:space="preserve"> vr 23 apr   </w:t>
+      </w:r>
+      <w:sdt>
+        <w:sdtPr>
+          <w14:checkbox>
+            <w14:checked w14:val="0"/>
+            <w14:checkedState w14:val="2612" w14:font="MS Gothic"/>
+            <w14:uncheckedState w14:val="2610" w14:font="MS Gothic"/>
+          </w14:checkbox>
+        </w:sdtPr>
+        <w:sdtContent>
+          <w:r>
+            <w:rPr>
+              <w:rFonts w:ascii="MS Gothic" w:eastAsia="MS Gothic" w:hAnsi="MS Gothic"/>
+              <w:sz w:val="20"/>
+            </w:rPr>
+            <w:t>☐</w:t>
+          </w:r>
+        </w:sdtContent>
+      </w:sdt>
+      <w:r>
+        <w:rPr>
+          <w:b w:val="0"/>
+          <w:color w:val="1B2630"/>
+          <w:sz w:val="17"/>
+        </w:rPr>
+        <w:t xml:space="preserve"> ma 26 apr, voormiddag   </w:t>
+      </w:r>
+      <w:sdt>
+        <w:sdtPr>
+          <w14:checkbox>
+            <w14:checked w14:val="0"/>
+            <w14:checkedState w14:val="2612" w14:font="MS Gothic"/>
+            <w14:uncheckedState w14:val="2610" w14:font="MS Gothic"/>
+          </w14:checkbox>
+        </w:sdtPr>
+        <w:sdtContent>
+          <w:r>
+            <w:rPr>
+              <w:rFonts w:ascii="MS Gothic" w:eastAsia="MS Gothic" w:hAnsi="MS Gothic"/>
+              <w:sz w:val="20"/>
+            </w:rPr>
+            <w:t>☐</w:t>
+          </w:r>
+        </w:sdtContent>
+      </w:sdt>
+      <w:r>
+        <w:rPr>
+          <w:b w:val="0"/>
+          <w:color w:val="1B2630"/>
+          <w:sz w:val="17"/>
+        </w:rPr>
+        <w:t xml:space="preserve"> di 27 apr   </w:t>
+      </w:r>
+      <w:sdt>
+        <w:sdtPr>
+          <w14:checkbox>
+            <w14:checked w14:val="0"/>
+            <w14:checkedState w14:val="2612" w14:font="MS Gothic"/>
+            <w14:uncheckedState w14:val="2610" w14:font="MS Gothic"/>
+          </w14:checkbox>
+        </w:sdtPr>
+        <w:sdtContent>
+          <w:r>
+            <w:rPr>
+              <w:rFonts w:ascii="MS Gothic" w:eastAsia="MS Gothic" w:hAnsi="MS Gothic"/>
+              <w:sz w:val="20"/>
+            </w:rPr>
+            <w:t>☐</w:t>
+          </w:r>
+        </w:sdtContent>
+      </w:sdt>
+      <w:r>
+        <w:rPr>
+          <w:b w:val="0"/>
+          <w:color w:val="1B2630"/>
+          <w:sz w:val="17"/>
+        </w:rPr>
+        <w:t xml:space="preserve"> vr 30 apr   </w:t>
+      </w:r>
+    </w:p>
+    <w:p>
+      <w:pPr>
+        <w:spacing w:before="200" w:after="80"/>
+      </w:pPr>
+      <w:r>
+        <w:rPr>
+          <w:b/>
+          <w:color w:val="FF7A00"/>
+          <w:sz w:val="22"/>
+        </w:rPr>
         <w:t xml:space="preserve">3  </w:t>
       </w:r>
       <w:r>
@@ -2275,7 +2211,7 @@
     </w:p>
     <w:p>
       <w:pPr>
-        <w:spacing w:before="320" w:after="0"/>
+        <w:spacing w:before="280" w:after="0"/>
         <w:pBdr>
           <w:bottom w:val="single" w:sz="4" w:space="1" w:color="B8C6D2"/>
           <w:between w:val="single" w:sz="4" w:space="1" w:color="B8C6D2"/>
@@ -2297,7 +2233,7 @@
     </w:p>
     <w:p>
       <w:pPr>
-        <w:spacing w:before="320" w:after="0"/>
+        <w:spacing w:before="280" w:after="0"/>
         <w:pBdr>
           <w:bottom w:val="single" w:sz="4" w:space="1" w:color="B8C6D2"/>
           <w:between w:val="single" w:sz="4" w:space="1" w:color="B8C6D2"/>
@@ -2327,7 +2263,7 @@
     </w:p>
     <w:p>
       <w:pPr>
-        <w:spacing w:before="360" w:after="0"/>
+        <w:spacing w:before="320" w:after="0"/>
         <w:pBdr>
           <w:bottom w:val="single" w:sz="4" w:space="1" w:color="B8C6D2"/>
           <w:between w:val="single" w:sz="4" w:space="1" w:color="B8C6D2"/>
@@ -2336,7 +2272,7 @@
     </w:p>
     <w:p>
       <w:pPr>
-        <w:spacing w:before="360" w:after="0"/>
+        <w:spacing w:before="320" w:after="0"/>
         <w:pBdr>
           <w:bottom w:val="single" w:sz="4" w:space="1" w:color="B8C6D2"/>
           <w:between w:val="single" w:sz="4" w:space="1" w:color="B8C6D2"/>
@@ -2345,7 +2281,7 @@
     </w:p>
     <w:p>
       <w:pPr>
-        <w:spacing w:before="360" w:after="0"/>
+        <w:spacing w:before="320" w:after="0"/>
         <w:pBdr>
           <w:bottom w:val="single" w:sz="4" w:space="1" w:color="B8C6D2"/>
           <w:between w:val="single" w:sz="4" w:space="1" w:color="B8C6D2"/>

</xml_diff>

<commit_message>
SEBIA 5 tussen 20 en 30 april: een voorgestelde dag per centrum in de opleidingsdocumenten en het overzicht
Kortrijk di 20 apr VM, Aalst di 20 apr NM, Gent vr 23 apr NM, Brugge ma 26 apr VM, Antwerpen di 27 apr VM,
Leuven vr 30 apr VM; op dagen van de lesgever en van de podologen. De aankruislijst met maartdata valt weg.

Co-Authored-By: Claude Opus 5.5 <noreply@anthropic.com>
</commit_message>
<xml_diff>
--- a/Educatie/Opleiding per centrum/PARADISE_opleiding_Aalst.docx
+++ b/Educatie/Opleiding per centrum/PARADISE_opleiding_Aalst.docx
@@ -38,7 +38,7 @@
           <w:color w:val="5A6A78"/>
           <w:sz w:val="17"/>
         </w:rPr>
-        <w:t>Stand op 7 oktober 2026  ·  voorstel, te bevestigen met de fiche op pagina 2</w:t>
+        <w:t>Stand op 8 oktober 2026  ·  voorstel, te bevestigen met de fiche op pagina 2</w:t>
       </w:r>
     </w:p>
     <w:tbl>
@@ -964,17 +964,7 @@
                 <w:color w:val="00407A"/>
                 <w:sz w:val="17"/>
               </w:rPr>
-              <w:t>25 mrt tot 30 apr 2027</w:t>
-            </w:r>
-          </w:p>
-          <w:p>
-            <w:r>
-              <w:rPr>
-                <w:b w:val="0"/>
-                <w:color w:val="5A6A78"/>
-                <w:sz w:val="15"/>
-              </w:rPr>
-              <w:t>(u kiest de dag op de fiche)</w:t>
+              <w:t>di 20 apr 2027, namiddag</w:t>
             </w:r>
           </w:p>
         </w:tc>
@@ -995,7 +985,7 @@
                 <w:color w:val="1B2630"/>
                 <w:sz w:val="17"/>
               </w:rPr>
-              <w:t>SEBIA 5: booster</w:t>
+              <w:t>SEBIA 5: booster (voorstel)</w:t>
             </w:r>
           </w:p>
         </w:tc>
@@ -1932,31 +1922,119 @@
           </w:p>
         </w:tc>
       </w:tr>
+      <w:tr>
+        <w:tc>
+          <w:tcPr>
+            <w:tcW w:type="dxa" w:w="4309"/>
+            <w:tcMar>
+              <w:top w:w="40" w:type="dxa"/>
+              <w:bottom w:w="40" w:type="dxa"/>
+              <w:left w:w="80" w:type="dxa"/>
+              <w:right w:w="80" w:type="dxa"/>
+            </w:tcMar>
+          </w:tcPr>
+          <w:p>
+            <w:r>
+              <w:rPr>
+                <w:b w:val="0"/>
+                <w:color w:val="1B2630"/>
+                <w:sz w:val="17"/>
+              </w:rPr>
+              <w:t>SEBIA 5</w:t>
+            </w:r>
+          </w:p>
+        </w:tc>
+        <w:tc>
+          <w:tcPr>
+            <w:tcW w:type="dxa" w:w="3288"/>
+            <w:tcMar>
+              <w:top w:w="40" w:type="dxa"/>
+              <w:bottom w:w="40" w:type="dxa"/>
+              <w:left w:w="80" w:type="dxa"/>
+              <w:right w:w="80" w:type="dxa"/>
+            </w:tcMar>
+          </w:tcPr>
+          <w:p>
+            <w:r>
+              <w:rPr>
+                <w:b w:val="0"/>
+                <w:color w:val="1B2630"/>
+                <w:sz w:val="17"/>
+              </w:rPr>
+              <w:t>di 20 apr, namiddag</w:t>
+            </w:r>
+          </w:p>
+        </w:tc>
+        <w:tc>
+          <w:tcPr>
+            <w:tcW w:type="dxa" w:w="2268"/>
+            <w:tcMar>
+              <w:top w:w="40" w:type="dxa"/>
+              <w:bottom w:w="40" w:type="dxa"/>
+              <w:left w:w="80" w:type="dxa"/>
+              <w:right w:w="80" w:type="dxa"/>
+            </w:tcMar>
+          </w:tcPr>
+          <w:p>
+            <w:sdt>
+              <w:sdtPr>
+                <w14:checkbox>
+                  <w14:checked w14:val="0"/>
+                  <w14:checkedState w14:val="2612" w14:font="MS Gothic"/>
+                  <w14:uncheckedState w14:val="2610" w14:font="MS Gothic"/>
+                </w14:checkbox>
+              </w:sdtPr>
+              <w:sdtContent>
+                <w:r>
+                  <w:rPr>
+                    <w:rFonts w:ascii="MS Gothic" w:eastAsia="MS Gothic" w:hAnsi="MS Gothic"/>
+                    <w:sz w:val="20"/>
+                  </w:rPr>
+                  <w:t>☐</w:t>
+                </w:r>
+              </w:sdtContent>
+            </w:sdt>
+            <w:r>
+              <w:rPr>
+                <w:b w:val="0"/>
+                <w:color w:val="1B2630"/>
+                <w:sz w:val="17"/>
+              </w:rPr>
+              <w:t xml:space="preserve"> ja   </w:t>
+            </w:r>
+            <w:sdt>
+              <w:sdtPr>
+                <w14:checkbox>
+                  <w14:checked w14:val="0"/>
+                  <w14:checkedState w14:val="2612" w14:font="MS Gothic"/>
+                  <w14:uncheckedState w14:val="2610" w14:font="MS Gothic"/>
+                </w14:checkbox>
+              </w:sdtPr>
+              <w:sdtContent>
+                <w:r>
+                  <w:rPr>
+                    <w:rFonts w:ascii="MS Gothic" w:eastAsia="MS Gothic" w:hAnsi="MS Gothic"/>
+                    <w:sz w:val="20"/>
+                  </w:rPr>
+                  <w:t>☐</w:t>
+                </w:r>
+              </w:sdtContent>
+            </w:sdt>
+            <w:r>
+              <w:rPr>
+                <w:b w:val="0"/>
+                <w:color w:val="1B2630"/>
+                <w:sz w:val="17"/>
+              </w:rPr>
+              <w:t xml:space="preserve"> nee   </w:t>
+            </w:r>
+          </w:p>
+        </w:tc>
+      </w:tr>
     </w:tbl>
     <w:p>
       <w:pPr>
-        <w:spacing w:before="200" w:after="80"/>
-      </w:pPr>
-      <w:r>
-        <w:rPr>
-          <w:b/>
-          <w:color w:val="FF7A00"/>
-          <w:sz w:val="22"/>
-        </w:rPr>
-        <w:t xml:space="preserve">2  </w:t>
-      </w:r>
-      <w:r>
-        <w:rPr>
-          <w:b/>
-          <w:color w:val="00407A"/>
-          <w:sz w:val="22"/>
-        </w:rPr>
-        <w:t>SEBIA 5: welke dagen passen?</w:t>
-      </w:r>
-    </w:p>
-    <w:p>
-      <w:pPr>
-        <w:spacing w:before="0" w:after="60"/>
+        <w:spacing w:before="60" w:after="0"/>
       </w:pPr>
       <w:r>
         <w:rPr>
@@ -1964,215 +2042,7 @@
           <w:color w:val="5A6A78"/>
           <w:sz w:val="17"/>
         </w:rPr>
-        <w:t>1,5 u per podoloog, in uw centrum. Dit zijn de dagen die de lesgever, Fabienne Dobbels, opgaf; kruis alles aan wat past.</w:t>
-      </w:r>
-    </w:p>
-    <w:p>
-      <w:pPr>
-        <w:spacing w:before="0" w:after="40"/>
-      </w:pPr>
-      <w:r>
-        <w:rPr>
-          <w:b/>
-          <w:color w:val="00407A"/>
-          <w:sz w:val="18"/>
-        </w:rPr>
-        <w:t xml:space="preserve">Vóór de paasvakantie:   </w:t>
-      </w:r>
-      <w:sdt>
-        <w:sdtPr>
-          <w14:checkbox>
-            <w14:checked w14:val="0"/>
-            <w14:checkedState w14:val="2612" w14:font="MS Gothic"/>
-            <w14:uncheckedState w14:val="2610" w14:font="MS Gothic"/>
-          </w14:checkbox>
-        </w:sdtPr>
-        <w:sdtContent>
-          <w:r>
-            <w:rPr>
-              <w:rFonts w:ascii="MS Gothic" w:eastAsia="MS Gothic" w:hAnsi="MS Gothic"/>
-              <w:sz w:val="20"/>
-            </w:rPr>
-            <w:t>☐</w:t>
-          </w:r>
-        </w:sdtContent>
-      </w:sdt>
-      <w:r>
-        <w:rPr>
-          <w:b w:val="0"/>
-          <w:color w:val="1B2630"/>
-          <w:sz w:val="17"/>
-        </w:rPr>
-        <w:t xml:space="preserve"> do 25 mrt, late namiddag   </w:t>
-      </w:r>
-      <w:sdt>
-        <w:sdtPr>
-          <w14:checkbox>
-            <w14:checked w14:val="0"/>
-            <w14:checkedState w14:val="2612" w14:font="MS Gothic"/>
-            <w14:uncheckedState w14:val="2610" w14:font="MS Gothic"/>
-          </w14:checkbox>
-        </w:sdtPr>
-        <w:sdtContent>
-          <w:r>
-            <w:rPr>
-              <w:rFonts w:ascii="MS Gothic" w:eastAsia="MS Gothic" w:hAnsi="MS Gothic"/>
-              <w:sz w:val="20"/>
-            </w:rPr>
-            <w:t>☐</w:t>
-          </w:r>
-        </w:sdtContent>
-      </w:sdt>
-      <w:r>
-        <w:rPr>
-          <w:b w:val="0"/>
-          <w:color w:val="1B2630"/>
-          <w:sz w:val="17"/>
-        </w:rPr>
-        <w:t xml:space="preserve"> vr 26 mrt   </w:t>
-      </w:r>
-    </w:p>
-    <w:p>
-      <w:pPr>
-        <w:spacing w:before="0" w:after="40"/>
-      </w:pPr>
-      <w:r>
-        <w:rPr>
-          <w:b/>
-          <w:color w:val="00407A"/>
-          <w:sz w:val="18"/>
-        </w:rPr>
-        <w:t xml:space="preserve">Na de paasvakantie:   </w:t>
-      </w:r>
-      <w:sdt>
-        <w:sdtPr>
-          <w14:checkbox>
-            <w14:checked w14:val="0"/>
-            <w14:checkedState w14:val="2612" w14:font="MS Gothic"/>
-            <w14:uncheckedState w14:val="2610" w14:font="MS Gothic"/>
-          </w14:checkbox>
-        </w:sdtPr>
-        <w:sdtContent>
-          <w:r>
-            <w:rPr>
-              <w:rFonts w:ascii="MS Gothic" w:eastAsia="MS Gothic" w:hAnsi="MS Gothic"/>
-              <w:sz w:val="20"/>
-            </w:rPr>
-            <w:t>☐</w:t>
-          </w:r>
-        </w:sdtContent>
-      </w:sdt>
-      <w:r>
-        <w:rPr>
-          <w:b w:val="0"/>
-          <w:color w:val="1B2630"/>
-          <w:sz w:val="17"/>
-        </w:rPr>
-        <w:t xml:space="preserve"> di 20 apr   </w:t>
-      </w:r>
-      <w:sdt>
-        <w:sdtPr>
-          <w14:checkbox>
-            <w14:checked w14:val="0"/>
-            <w14:checkedState w14:val="2612" w14:font="MS Gothic"/>
-            <w14:uncheckedState w14:val="2610" w14:font="MS Gothic"/>
-          </w14:checkbox>
-        </w:sdtPr>
-        <w:sdtContent>
-          <w:r>
-            <w:rPr>
-              <w:rFonts w:ascii="MS Gothic" w:eastAsia="MS Gothic" w:hAnsi="MS Gothic"/>
-              <w:sz w:val="20"/>
-            </w:rPr>
-            <w:t>☐</w:t>
-          </w:r>
-        </w:sdtContent>
-      </w:sdt>
-      <w:r>
-        <w:rPr>
-          <w:b w:val="0"/>
-          <w:color w:val="1B2630"/>
-          <w:sz w:val="17"/>
-        </w:rPr>
-        <w:t xml:space="preserve"> vr 23 apr   </w:t>
-      </w:r>
-      <w:sdt>
-        <w:sdtPr>
-          <w14:checkbox>
-            <w14:checked w14:val="0"/>
-            <w14:checkedState w14:val="2612" w14:font="MS Gothic"/>
-            <w14:uncheckedState w14:val="2610" w14:font="MS Gothic"/>
-          </w14:checkbox>
-        </w:sdtPr>
-        <w:sdtContent>
-          <w:r>
-            <w:rPr>
-              <w:rFonts w:ascii="MS Gothic" w:eastAsia="MS Gothic" w:hAnsi="MS Gothic"/>
-              <w:sz w:val="20"/>
-            </w:rPr>
-            <w:t>☐</w:t>
-          </w:r>
-        </w:sdtContent>
-      </w:sdt>
-      <w:r>
-        <w:rPr>
-          <w:b w:val="0"/>
-          <w:color w:val="1B2630"/>
-          <w:sz w:val="17"/>
-        </w:rPr>
-        <w:t xml:space="preserve"> ma 26 apr, voormiddag   </w:t>
-      </w:r>
-      <w:sdt>
-        <w:sdtPr>
-          <w14:checkbox>
-            <w14:checked w14:val="0"/>
-            <w14:checkedState w14:val="2612" w14:font="MS Gothic"/>
-            <w14:uncheckedState w14:val="2610" w14:font="MS Gothic"/>
-          </w14:checkbox>
-        </w:sdtPr>
-        <w:sdtContent>
-          <w:r>
-            <w:rPr>
-              <w:rFonts w:ascii="MS Gothic" w:eastAsia="MS Gothic" w:hAnsi="MS Gothic"/>
-              <w:sz w:val="20"/>
-            </w:rPr>
-            <w:t>☐</w:t>
-          </w:r>
-        </w:sdtContent>
-      </w:sdt>
-      <w:r>
-        <w:rPr>
-          <w:b w:val="0"/>
-          <w:color w:val="1B2630"/>
-          <w:sz w:val="17"/>
-        </w:rPr>
-        <w:t xml:space="preserve"> di 27 apr   </w:t>
-      </w:r>
-      <w:sdt>
-        <w:sdtPr>
-          <w14:checkbox>
-            <w14:checked w14:val="0"/>
-            <w14:checkedState w14:val="2612" w14:font="MS Gothic"/>
-            <w14:uncheckedState w14:val="2610" w14:font="MS Gothic"/>
-          </w14:checkbox>
-        </w:sdtPr>
-        <w:sdtContent>
-          <w:r>
-            <w:rPr>
-              <w:rFonts w:ascii="MS Gothic" w:eastAsia="MS Gothic" w:hAnsi="MS Gothic"/>
-              <w:sz w:val="20"/>
-            </w:rPr>
-            <w:t>☐</w:t>
-          </w:r>
-        </w:sdtContent>
-      </w:sdt>
-      <w:r>
-        <w:rPr>
-          <w:b w:val="0"/>
-          <w:color w:val="1B2630"/>
-          <w:sz w:val="17"/>
-        </w:rPr>
-        <w:t xml:space="preserve"> vr 30 apr   </w:t>
+        <w:t>Past SEBIA 5 niet? De lesgever, Fabienne Dobbels, kan op meer dagen tussen 20 en 30 april; noteer dan bij de opmerkingen welke dag wel past.</w:t>
       </w:r>
     </w:p>
     <w:p>
@@ -2185,7 +2055,7 @@
           <w:color w:val="FF7A00"/>
           <w:sz w:val="22"/>
         </w:rPr>
-        <w:t xml:space="preserve">3  </w:t>
+        <w:t xml:space="preserve">2  </w:t>
       </w:r>
       <w:r>
         <w:rPr>
@@ -2250,7 +2120,7 @@
           <w:color w:val="FF7A00"/>
           <w:sz w:val="22"/>
         </w:rPr>
-        <w:t xml:space="preserve">4  </w:t>
+        <w:t xml:space="preserve">3  </w:t>
       </w:r>
       <w:r>
         <w:rPr>

</xml_diff>